<commit_message>
Update main pages, user guide, and teamwork document
</commit_message>
<xml_diff>
--- a/Teamwork Discussion Sheet.docx
+++ b/Teamwork Discussion Sheet.docx
@@ -932,14 +932,6 @@
                 <w:shd w:val="clear" w:color="auto" w:fill="FFFFFF"/>
               </w:rPr>
               <w:br/>
-            </w:r>
-            <w:r>
-              <w:rPr>
-                <w:color w:val="0F1115"/>
-                <w:sz w:val="23"/>
-                <w:szCs w:val="23"/>
-                <w:shd w:val="clear" w:color="auto" w:fill="FFFFFF"/>
-              </w:rPr>
               <w:t>(Rachel)</w:t>
             </w:r>
           </w:p>
@@ -956,8 +948,11 @@
               <w:jc w:val="center"/>
               <w:cnfStyle w:val="000000000000" w:firstRow="0" w:lastRow="0" w:firstColumn="0" w:lastColumn="0" w:oddVBand="0" w:evenVBand="0" w:oddHBand="0" w:evenHBand="0" w:firstRowFirstColumn="0" w:firstRowLastColumn="0" w:lastRowFirstColumn="0" w:lastRowLastColumn="0"/>
               <w:rPr>
-                <w:sz w:val="23"/>
-                <w:szCs w:val="23"/>
+                <w:rFonts w:hint="eastAsia"/>
+                <w:color w:val="0F1115"/>
+                <w:sz w:val="23"/>
+                <w:szCs w:val="23"/>
+                <w:shd w:val="clear" w:color="auto" w:fill="FFFFFF"/>
               </w:rPr>
             </w:pPr>
             <w:r>
@@ -1048,7 +1043,23 @@
                 <w:szCs w:val="23"/>
                 <w:lang w:eastAsia="zh-CN"/>
               </w:rPr>
-              <w:t>27%</w:t>
+              <w:t>2</w:t>
+            </w:r>
+            <w:r>
+              <w:rPr>
+                <w:sz w:val="23"/>
+                <w:szCs w:val="23"/>
+                <w:lang w:eastAsia="zh-CN"/>
+              </w:rPr>
+              <w:t>5</w:t>
+            </w:r>
+            <w:r>
+              <w:rPr>
+                <w:sz w:val="23"/>
+                <w:szCs w:val="23"/>
+                <w:lang w:eastAsia="zh-CN"/>
+              </w:rPr>
+              <w:t>%</w:t>
             </w:r>
           </w:p>
         </w:tc>
@@ -1256,7 +1267,7 @@
                 <w:sz w:val="23"/>
                 <w:szCs w:val="23"/>
               </w:rPr>
-              <w:t>CSS styling for all pages (8 CSS files)</w:t>
+              <w:t>Base CSS styling (00-admin page.css, 01-student page.css, index.css)</w:t>
             </w:r>
           </w:p>
         </w:tc>
@@ -1585,8 +1596,10 @@
               <w:pStyle w:val="Standard"/>
               <w:jc w:val="center"/>
               <w:rPr>
-                <w:sz w:val="23"/>
-                <w:szCs w:val="23"/>
+                <w:color w:val="0F1115"/>
+                <w:sz w:val="23"/>
+                <w:szCs w:val="23"/>
+                <w:shd w:val="clear" w:color="auto" w:fill="FFFFFF"/>
               </w:rPr>
             </w:pPr>
             <w:proofErr w:type="spellStart"/>
@@ -1617,14 +1630,6 @@
                 <w:shd w:val="clear" w:color="auto" w:fill="FFFFFF"/>
               </w:rPr>
               <w:br/>
-            </w:r>
-            <w:r>
-              <w:rPr>
-                <w:color w:val="0F1115"/>
-                <w:sz w:val="23"/>
-                <w:szCs w:val="23"/>
-                <w:shd w:val="clear" w:color="auto" w:fill="FFFFFF"/>
-              </w:rPr>
               <w:t>(</w:t>
             </w:r>
             <w:r>
@@ -1651,8 +1656,10 @@
               <w:jc w:val="center"/>
               <w:cnfStyle w:val="000000000000" w:firstRow="0" w:lastRow="0" w:firstColumn="0" w:lastColumn="0" w:oddVBand="0" w:evenVBand="0" w:oddHBand="0" w:evenHBand="0" w:firstRowFirstColumn="0" w:firstRowLastColumn="0" w:lastRowFirstColumn="0" w:lastRowLastColumn="0"/>
               <w:rPr>
-                <w:sz w:val="23"/>
-                <w:szCs w:val="23"/>
+                <w:color w:val="0F1115"/>
+                <w:sz w:val="23"/>
+                <w:szCs w:val="23"/>
+                <w:shd w:val="clear" w:color="auto" w:fill="FFFFFF"/>
               </w:rPr>
             </w:pPr>
             <w:r>
@@ -1692,7 +1699,7 @@
                 <w:szCs w:val="23"/>
                 <w:shd w:val="clear" w:color="auto" w:fill="FFFFFF"/>
               </w:rPr>
-              <w:t>Dashboard page with 4 course cards</w:t>
+              <w:t>Drafted initial requirements and feature list</w:t>
             </w:r>
           </w:p>
         </w:tc>
@@ -1705,18 +1712,33 @@
               <w:pStyle w:val="Standard"/>
               <w:cnfStyle w:val="000000000000" w:firstRow="0" w:lastRow="0" w:firstColumn="0" w:lastColumn="0" w:oddVBand="0" w:evenVBand="0" w:oddHBand="0" w:evenHBand="0" w:firstRowFirstColumn="0" w:firstRowLastColumn="0" w:lastRowFirstColumn="0" w:lastRowLastColumn="0"/>
               <w:rPr>
-                <w:sz w:val="23"/>
-                <w:szCs w:val="23"/>
-              </w:rPr>
-            </w:pPr>
-            <w:r>
-              <w:rPr>
-                <w:color w:val="0F1115"/>
-                <w:sz w:val="23"/>
-                <w:szCs w:val="23"/>
-                <w:shd w:val="clear" w:color="auto" w:fill="FFFFFF"/>
-              </w:rPr>
-              <w:t>30%</w:t>
+                <w:rFonts w:hint="eastAsia"/>
+                <w:color w:val="0F1115"/>
+                <w:sz w:val="23"/>
+                <w:szCs w:val="23"/>
+                <w:shd w:val="clear" w:color="auto" w:fill="FFFFFF"/>
+                <w:lang w:eastAsia="zh-CN"/>
+              </w:rPr>
+            </w:pPr>
+            <w:r>
+              <w:rPr>
+                <w:color w:val="0F1115"/>
+                <w:sz w:val="23"/>
+                <w:szCs w:val="23"/>
+                <w:shd w:val="clear" w:color="auto" w:fill="FFFFFF"/>
+                <w:lang w:eastAsia="zh-CN"/>
+              </w:rPr>
+              <w:t>20</w:t>
+            </w:r>
+            <w:r>
+              <w:rPr>
+                <w:color w:val="0F1115"/>
+                <w:sz w:val="23"/>
+                <w:szCs w:val="23"/>
+                <w:shd w:val="clear" w:color="auto" w:fill="FFFFFF"/>
+                <w:lang w:eastAsia="zh-CN"/>
+              </w:rPr>
+              <w:t>%</w:t>
             </w:r>
           </w:p>
         </w:tc>
@@ -1732,18 +1754,38 @@
               <w:jc w:val="center"/>
               <w:cnfStyle w:val="000000000000" w:firstRow="0" w:lastRow="0" w:firstColumn="0" w:lastColumn="0" w:oddVBand="0" w:evenVBand="0" w:oddHBand="0" w:evenHBand="0" w:firstRowFirstColumn="0" w:firstRowLastColumn="0" w:lastRowFirstColumn="0" w:lastRowLastColumn="0"/>
               <w:rPr>
-                <w:sz w:val="23"/>
-                <w:szCs w:val="23"/>
-              </w:rPr>
-            </w:pPr>
-            <w:r>
-              <w:rPr>
-                <w:color w:val="0F1115"/>
-                <w:sz w:val="23"/>
-                <w:szCs w:val="23"/>
-                <w:shd w:val="clear" w:color="auto" w:fill="FFFFFF"/>
-              </w:rPr>
-              <w:t>24%</w:t>
+                <w:color w:val="0F1115"/>
+                <w:sz w:val="23"/>
+                <w:szCs w:val="23"/>
+                <w:shd w:val="clear" w:color="auto" w:fill="FFFFFF"/>
+              </w:rPr>
+            </w:pPr>
+            <w:r>
+              <w:rPr>
+                <w:color w:val="0F1115"/>
+                <w:sz w:val="23"/>
+                <w:szCs w:val="23"/>
+                <w:shd w:val="clear" w:color="auto" w:fill="FFFFFF"/>
+              </w:rPr>
+              <w:t>2</w:t>
+            </w:r>
+            <w:r>
+              <w:rPr>
+                <w:color w:val="0F1115"/>
+                <w:sz w:val="23"/>
+                <w:szCs w:val="23"/>
+                <w:shd w:val="clear" w:color="auto" w:fill="FFFFFF"/>
+              </w:rPr>
+              <w:t>5</w:t>
+            </w:r>
+            <w:r>
+              <w:rPr>
+                <w:color w:val="0F1115"/>
+                <w:sz w:val="23"/>
+                <w:szCs w:val="23"/>
+                <w:shd w:val="clear" w:color="auto" w:fill="FFFFFF"/>
+              </w:rPr>
+              <w:t>%</w:t>
             </w:r>
           </w:p>
         </w:tc>
@@ -1817,18 +1859,20 @@
               </w:numPr>
               <w:cnfStyle w:val="000000000000" w:firstRow="0" w:lastRow="0" w:firstColumn="0" w:lastColumn="0" w:oddVBand="0" w:evenVBand="0" w:oddHBand="0" w:evenHBand="0" w:firstRowFirstColumn="0" w:firstRowLastColumn="0" w:lastRowFirstColumn="0" w:lastRowLastColumn="0"/>
               <w:rPr>
-                <w:sz w:val="23"/>
-                <w:szCs w:val="23"/>
-              </w:rPr>
-            </w:pPr>
-            <w:r>
-              <w:rPr>
-                <w:color w:val="0F1115"/>
-                <w:sz w:val="23"/>
-                <w:szCs w:val="23"/>
-                <w:shd w:val="clear" w:color="auto" w:fill="FFFFFF"/>
-              </w:rPr>
-              <w:t>Progress bars for each course</w:t>
+                <w:color w:val="0F1115"/>
+                <w:sz w:val="23"/>
+                <w:szCs w:val="23"/>
+                <w:shd w:val="clear" w:color="auto" w:fill="FFFFFF"/>
+              </w:rPr>
+            </w:pPr>
+            <w:r>
+              <w:rPr>
+                <w:color w:val="0F1115"/>
+                <w:sz w:val="23"/>
+                <w:szCs w:val="23"/>
+                <w:shd w:val="clear" w:color="auto" w:fill="FFFFFF"/>
+              </w:rPr>
+              <w:t>Dashboard page with 4 course cards</w:t>
             </w:r>
           </w:p>
         </w:tc>
@@ -1852,7 +1896,7 @@
                 <w:szCs w:val="23"/>
                 <w:shd w:val="clear" w:color="auto" w:fill="FFFFFF"/>
               </w:rPr>
-              <w:t>25%</w:t>
+              <w:t>30%</w:t>
             </w:r>
           </w:p>
         </w:tc>
@@ -1955,7 +1999,7 @@
                 <w:szCs w:val="23"/>
                 <w:shd w:val="clear" w:color="auto" w:fill="FFFFFF"/>
               </w:rPr>
-              <w:t>Edit panel with assessment dropdown</w:t>
+              <w:t>Progress bars for each course</w:t>
             </w:r>
           </w:p>
         </w:tc>
@@ -2082,7 +2126,7 @@
                 <w:szCs w:val="23"/>
                 <w:shd w:val="clear" w:color="auto" w:fill="FFFFFF"/>
               </w:rPr>
-              <w:t>JavaScript for panel open/close</w:t>
+              <w:t>Edit panel with assessment dropdown</w:t>
             </w:r>
           </w:p>
         </w:tc>
@@ -2106,7 +2150,7 @@
                 <w:szCs w:val="23"/>
                 <w:shd w:val="clear" w:color="auto" w:fill="FFFFFF"/>
               </w:rPr>
-              <w:t>20%</w:t>
+              <w:t>25%</w:t>
             </w:r>
           </w:p>
         </w:tc>
@@ -2240,7 +2284,7 @@
                 <w:szCs w:val="23"/>
                 <w:shd w:val="clear" w:color="auto" w:fill="FFFFFF"/>
               </w:rPr>
-              <w:t>My course page with course cards grid</w:t>
+              <w:t>Student-Assessments.html (course cards grid)</w:t>
             </w:r>
           </w:p>
         </w:tc>
@@ -2291,7 +2335,25 @@
                 <w:szCs w:val="23"/>
                 <w:shd w:val="clear" w:color="auto" w:fill="FFFFFF"/>
               </w:rPr>
-              <w:t>24%</w:t>
+              <w:t>2</w:t>
+            </w:r>
+            <w:r>
+              <w:rPr>
+                <w:color w:val="0F1115"/>
+                <w:sz w:val="23"/>
+                <w:szCs w:val="23"/>
+                <w:shd w:val="clear" w:color="auto" w:fill="FFFFFF"/>
+              </w:rPr>
+              <w:t>5</w:t>
+            </w:r>
+            <w:r>
+              <w:rPr>
+                <w:color w:val="0F1115"/>
+                <w:sz w:val="23"/>
+                <w:szCs w:val="23"/>
+                <w:shd w:val="clear" w:color="auto" w:fill="FFFFFF"/>
+              </w:rPr>
+              <w:t>%</w:t>
             </w:r>
           </w:p>
         </w:tc>
@@ -2493,7 +2555,7 @@
                 <w:szCs w:val="23"/>
                 <w:shd w:val="clear" w:color="auto" w:fill="FFFFFF"/>
               </w:rPr>
-              <w:t>Student/Admin view toggle (Stu/Adm button)</w:t>
+              <w:t>Admin-Management-Assessments.html (admin assessment editor)</w:t>
             </w:r>
           </w:p>
         </w:tc>
@@ -2960,7 +3022,7 @@
           <w:sz w:val="23"/>
           <w:szCs w:val="23"/>
         </w:rPr>
-        <w:t xml:space="preserve"> handled the My course page with assessment structures.</w:t>
+        <w:t xml:space="preserve"> handled the assessment pages with student and admin views.</w:t>
       </w:r>
     </w:p>
     <w:p>
@@ -3015,27 +3077,7 @@
           <w:sz w:val="23"/>
           <w:szCs w:val="23"/>
         </w:rPr>
-        <w:t>Meeting 3 (</w:t>
-      </w:r>
-      <w:r>
-        <w:rPr>
-          <w:rStyle w:val="aa"/>
-          <w:rFonts w:ascii="Times New Roman" w:hAnsi="Times New Roman" w:cs="Times New Roman"/>
-          <w:color w:val="0F1115"/>
-          <w:sz w:val="23"/>
-          <w:szCs w:val="23"/>
-        </w:rPr>
-        <w:t>Third week</w:t>
-      </w:r>
-      <w:r>
-        <w:rPr>
-          <w:rStyle w:val="aa"/>
-          <w:rFonts w:ascii="Times New Roman" w:hAnsi="Times New Roman" w:cs="Times New Roman"/>
-          <w:color w:val="0F1115"/>
-          <w:sz w:val="23"/>
-          <w:szCs w:val="23"/>
-        </w:rPr>
-        <w:t xml:space="preserve"> - final review):</w:t>
+        <w:t>Meeting 3 (Third week - final review):</w:t>
       </w:r>
       <w:r>
         <w:rPr>

</xml_diff>